<commit_message>
docs: archive June proposals, fix workbook and checklist contradictions, screenshots
Co-Authored-By: Claude Fable 5.1 <noreply@anthropic.com>
Claude-Session: https://claude.ai/code/session_01AgJe9NPUSzjMp3Tp3LqBxk
</commit_message>
<xml_diff>
--- a/docs/Guya_V1_Test_and_Evaluation.docx
+++ b/docs/Guya_V1_Test_and_Evaluation.docx
@@ -499,7 +499,7 @@
                 <w:color w:val="111827"/>
                 <w:sz w:val="20"/>
               </w:rPr>
-              <w:t>Run the tests in order. Wait for Guya’s spoken response before starting the next command.</w:t>
+              <w:t>Run the tests in order. Wait for Guya’s response (spoken in English; on-screen only for Persian) before starting the next command.</w:t>
             </w:r>
           </w:p>
         </w:tc>
@@ -3677,7 +3677,7 @@
                 <w:color w:val="111827"/>
                 <w:sz w:val="16"/>
               </w:rPr>
-              <w:t>test6.docx is created in Documents and opened.</w:t>
+              <w:t>test6.docx is created in Documents; Guya asks whether to open it. Say Yes.</w:t>
             </w:r>
           </w:p>
         </w:tc>
@@ -5406,7 +5406,7 @@
                 <w:color w:val="111827"/>
                 <w:sz w:val="16"/>
               </w:rPr>
-              <w:t>فایل آزمون شش.docx ساخته و باز شود.</w:t>
+              <w:t>فایل آزمون شش.docx ساخته شود و گویا بپرسد باز کند یا نه؛ بگویید بله.</w:t>
             </w:r>
           </w:p>
         </w:tc>

</xml_diff>